<commit_message>
vault backup: 2026-05-06 20:29:12
</commit_message>
<xml_diff>
--- a/学校事务/编译原理/拓展阅读/12303070250黄彬.docx
+++ b/学校事务/编译原理/拓展阅读/12303070250黄彬.docx
@@ -75,7 +75,6 @@
         <w:tc>
           <w:tcPr>
             <w:tcW w:w="4646" w:type="dxa"/>
-            <w:shd w:val="clear" w:color="auto" w:fill="D9EAF7"/>
             <w:vAlign w:val="center"/>
           </w:tcPr>
           <w:p>
@@ -122,7 +121,6 @@
         <w:tc>
           <w:tcPr>
             <w:tcW w:w="4646" w:type="dxa"/>
-            <w:shd w:val="clear" w:color="auto" w:fill="D9EAF7"/>
             <w:vAlign w:val="center"/>
           </w:tcPr>
           <w:p>
@@ -171,7 +169,6 @@
         <w:tc>
           <w:tcPr>
             <w:tcW w:w="4646" w:type="dxa"/>
-            <w:shd w:val="clear" w:color="auto" w:fill="D9EAF7"/>
             <w:vAlign w:val="center"/>
           </w:tcPr>
           <w:p>
@@ -231,7 +228,6 @@
         <w:tc>
           <w:tcPr>
             <w:tcW w:w="4646" w:type="dxa"/>
-            <w:shd w:val="clear" w:color="auto" w:fill="D9EAF7"/>
             <w:vAlign w:val="center"/>
           </w:tcPr>
           <w:p>
@@ -286,7 +282,6 @@
         <w:tc>
           <w:tcPr>
             <w:tcW w:w="4646" w:type="dxa"/>
-            <w:shd w:val="clear" w:color="auto" w:fill="D9EAF7"/>
             <w:vAlign w:val="center"/>
           </w:tcPr>
           <w:p>

</xml_diff>